<commit_message>
Update nama Founder: Aditiya Nugraha di Proposal dan Company Profile
</commit_message>
<xml_diff>
--- a/Proposal_Kerjasama_PPBIB.docx
+++ b/Proposal_Kerjasama_PPBIB.docx
@@ -2143,9 +2143,10 @@
             </w:pPr>
             <w:r>
               <w:rPr>
+                <w:b/>
                 <w:sz w:val="20"/>
               </w:rPr>
-              <w:t>_________________________</w:t>
+              <w:t>Aditiya Nugraha</w:t>
             </w:r>
           </w:p>
           <w:p>
@@ -2157,7 +2158,7 @@
                 <w:b/>
                 <w:sz w:val="20"/>
               </w:rPr>
-              <w:t>Pimpinan PPBIB</w:t>
+              <w:t>Founder PPBIB</w:t>
             </w:r>
           </w:p>
           <w:p>

</xml_diff>